<commit_message>
Station health: list every seismic station; PTSP wording fixes
- station_qc.py also reports stations bound in SeisComP or ever in the archive
  that have no recent data, with their last data day from the archive. They no
  longer vanish after 60 days; retired channels on live stations are ignored.
- The Telegram caption counts stations silent for over 30 days instead of
  listing them, so new problems stay within the caption limit.
- PTSP: three more typos fixed in the nol rupiah letter; "Teropong Rukyat"
  without "(low grade)".

Co-Authored-By: Claude Opus 5.5 <noreply@anthropic.com>
</commit_message>
<xml_diff>
--- a/theme/static/images/layanan/Surat-Pernyataan-Nol-Rupiah.docx
+++ b/theme/static/images/layanan/Surat-Pernyataan-Nol-Rupiah.docx
@@ -950,7 +950,7 @@
         <w:rPr>
           <w:rFonts w:ascii="Arial" w:hAnsi="Arial" w:cs="Arial"/>
         </w:rPr>
-        <w:t xml:space="preserve">Dalam hal  saya  tidak  menyerahkan  hasil hasil  ............. </w:t>
+        <w:t xml:space="preserve">Dalam hal  saya  tidak  menyerahkan  hasil  ............. </w:t>
       </w:r>
       <w:r>
         <w:rPr>
@@ -2838,7 +2838,7 @@
                 <w:rFonts w:ascii="Arial" w:hAnsi="Arial" w:cs="Arial"/>
                 <w:sz w:val="20"/>
               </w:rPr>
-              <w:t>12))</w:t>
+              <w:t>12)</w:t>
             </w:r>
           </w:p>
         </w:tc>
@@ -3013,7 +3013,7 @@
                 <w:rFonts w:ascii="Arial" w:hAnsi="Arial" w:cs="Arial"/>
                 <w:sz w:val="20"/>
               </w:rPr>
-              <w:t>Diisi dengan kota ditandantanganinya Surat Pernyataan</w:t>
+              <w:t>Diisi dengan kota ditandatanganinya Surat Pernyataan</w:t>
             </w:r>
           </w:p>
         </w:tc>

</xml_diff>